<commit_message>
Deploying to gh-pages from @ Morrison-Lab/mcs@e6054d95be6d6d78acbee2ecf50bb40cc603b0c0 🚀
</commit_message>
<xml_diff>
--- a/chapters/syllabus.docx
+++ b/chapters/syllabus.docx
@@ -23,7 +23,7 @@
         <w:pStyle w:val="Date"/>
       </w:pPr>
       <w:r>
-        <w:t xml:space="preserve">Last modified: 2026-10-23 15:03:04 (PDT)</w:t>
+        <w:t xml:space="preserve">Last modified: 2026-10-23 15:51:55 (PDT)</w:t>
       </w:r>
     </w:p>
     <w:tbl>
@@ -1237,7 +1237,7 @@
       </w:r>
     </w:p>
     <w:bookmarkEnd w:id="23"/>
-    <w:bookmarkStart w:id="29" w:name="schedule"/>
+    <w:bookmarkStart w:id="30" w:name="schedule"/>
     <w:p>
       <w:pPr>
         <w:pStyle w:val="Heading2"/>
@@ -1252,6 +1252,41 @@
       </w:pPr>
       <w:r>
         <w:t xml:space="preserve">The topics and dates of future lectures may change.</w:t>
+      </w:r>
+      <w:r>
+        <w:t xml:space="preserve"> </w:t>
+      </w:r>
+      <w:r>
+        <w:t xml:space="preserve">The</w:t>
+      </w:r>
+      <w:r>
+        <w:t xml:space="preserve"> </w:t>
+      </w:r>
+      <w:hyperlink r:id="rId24">
+        <w:r>
+          <w:rPr>
+            <w:rStyle w:val="Hyperlink"/>
+          </w:rPr>
+          <w:t xml:space="preserve">course calendar</w:t>
+        </w:r>
+      </w:hyperlink>
+      <w:r>
+        <w:t xml:space="preserve"> </w:t>
+      </w:r>
+      <w:r>
+        <w:t xml:space="preserve">gives the day-by-day agenda,</w:t>
+      </w:r>
+      <w:r>
+        <w:t xml:space="preserve"> </w:t>
+      </w:r>
+      <w:r>
+        <w:t xml:space="preserve">including every deadline;</w:t>
+      </w:r>
+      <w:r>
+        <w:t xml:space="preserve"> </w:t>
+      </w:r>
+      <w:r>
+        <w:t xml:space="preserve">the table below gives the topics and readings week by week.</w:t>
       </w:r>
       <w:r>
         <w:t xml:space="preserve"> </w:t>
@@ -1423,7 +1458,7 @@
             <w:r>
               <w:t xml:space="preserve"> </w:t>
             </w:r>
-            <w:hyperlink r:id="rId24">
+            <w:hyperlink r:id="rId25">
               <w:r>
                 <w:rPr>
                   <w:rStyle w:val="Hyperlink"/>
@@ -1437,7 +1472,7 @@
             <w:r>
               <w:t xml:space="preserve"> </w:t>
             </w:r>
-            <w:hyperlink r:id="rId25">
+            <w:hyperlink r:id="rId26">
               <w:r>
                 <w:rPr>
                   <w:rStyle w:val="Hyperlink"/>
@@ -1451,7 +1486,7 @@
             <w:r>
               <w:t xml:space="preserve"> </w:t>
             </w:r>
-            <w:hyperlink r:id="rId26">
+            <w:hyperlink r:id="rId27">
               <w:r>
                 <w:rPr>
                   <w:rStyle w:val="Hyperlink"/>
@@ -1524,7 +1559,7 @@
             <w:r>
               <w:t xml:space="preserve"> </w:t>
             </w:r>
-            <w:hyperlink r:id="rId27">
+            <w:hyperlink r:id="rId28">
               <w:r>
                 <w:rPr>
                   <w:rStyle w:val="Hyperlink"/>
@@ -1538,7 +1573,7 @@
             <w:r>
               <w:t xml:space="preserve"> </w:t>
             </w:r>
-            <w:hyperlink r:id="rId28">
+            <w:hyperlink r:id="rId29">
               <w:r>
                 <w:rPr>
                   <w:rStyle w:val="Hyperlink"/>
@@ -2131,17 +2166,7 @@
               <w:t xml:space="preserve">Final exam</w:t>
             </w:r>
             <w:r>
-              <w:t xml:space="preserve">,</w:t>
-            </w:r>
-            <w:r>
-              <w:t xml:space="preserve"> </w:t>
-            </w:r>
-            <w:r>
-              <w:rPr>
-                <w:b/>
-                <w:bCs/>
-              </w:rPr>
-              <w:t xml:space="preserve">TBD</w:t>
+              <w:t xml:space="preserve">: Tuesday, Mar 16 (CRNs 13745, 13746) or Thursday, Mar 18 (CRNs 13747, 13748), 10:30am–12:30pm</w:t>
             </w:r>
           </w:p>
         </w:tc>
@@ -2175,8 +2200,8 @@
         <w:t xml:space="preserve">at least two weeks before that exam is given.</w:t>
       </w:r>
     </w:p>
-    <w:bookmarkEnd w:id="29"/>
-    <w:bookmarkStart w:id="30" w:name="communication"/>
+    <w:bookmarkEnd w:id="30"/>
+    <w:bookmarkStart w:id="31" w:name="communication"/>
     <w:p>
       <w:pPr>
         <w:pStyle w:val="Heading2"/>
@@ -2341,8 +2366,8 @@
         <w:t xml:space="preserve">also go in a Canvas message to me, not to my email.</w:t>
       </w:r>
     </w:p>
-    <w:bookmarkEnd w:id="30"/>
-    <w:bookmarkStart w:id="31" w:name="questions-and-corrections"/>
+    <w:bookmarkEnd w:id="31"/>
+    <w:bookmarkStart w:id="32" w:name="questions-and-corrections"/>
     <w:p>
       <w:pPr>
         <w:pStyle w:val="Heading2"/>
@@ -2409,8 +2434,8 @@
         <w:t xml:space="preserve">If you are not, we can jointly find out where the confusion started.</w:t>
       </w:r>
     </w:p>
-    <w:bookmarkEnd w:id="31"/>
-    <w:bookmarkStart w:id="32" w:name="health-precautions"/>
+    <w:bookmarkEnd w:id="32"/>
+    <w:bookmarkStart w:id="33" w:name="health-precautions"/>
     <w:p>
       <w:pPr>
         <w:pStyle w:val="Heading2"/>
@@ -2445,8 +2470,8 @@
         <w:t xml:space="preserve">Please contact me if you have questions, concerns, or suggestions.</w:t>
       </w:r>
     </w:p>
-    <w:bookmarkEnd w:id="32"/>
-    <w:bookmarkStart w:id="34" w:name="software"/>
+    <w:bookmarkEnd w:id="33"/>
+    <w:bookmarkStart w:id="35" w:name="software"/>
     <w:p>
       <w:pPr>
         <w:pStyle w:val="Heading2"/>
@@ -2465,7 +2490,7 @@
       <w:r>
         <w:t xml:space="preserve"> </w:t>
       </w:r>
-      <w:hyperlink r:id="rId33">
+      <w:hyperlink r:id="rId34">
         <w:r>
           <w:rPr>
             <w:rStyle w:val="Hyperlink"/>
@@ -2501,8 +2526,8 @@
         <w:t xml:space="preserve">please use the default installed version.</w:t>
       </w:r>
     </w:p>
-    <w:bookmarkEnd w:id="34"/>
-    <w:bookmarkStart w:id="37" w:name="active-learning"/>
+    <w:bookmarkEnd w:id="35"/>
+    <w:bookmarkStart w:id="38" w:name="active-learning"/>
     <w:p>
       <w:pPr>
         <w:pStyle w:val="Heading2"/>
@@ -2549,7 +2574,7 @@
         <w:t xml:space="preserve">Please give me feedback about the structure of the class, the activities, or group dynamics.</w:t>
       </w:r>
     </w:p>
-    <w:bookmarkStart w:id="35" w:name="abcd-cards"/>
+    <w:bookmarkStart w:id="36" w:name="abcd-cards"/>
     <w:p>
       <w:pPr>
         <w:pStyle w:val="Heading3"/>
@@ -2627,8 +2652,8 @@
         <w:t xml:space="preserve">).</w:t>
       </w:r>
     </w:p>
-    <w:bookmarkEnd w:id="35"/>
-    <w:bookmarkStart w:id="36" w:name="worksheets"/>
+    <w:bookmarkEnd w:id="36"/>
+    <w:bookmarkStart w:id="37" w:name="worksheets"/>
     <w:p>
       <w:pPr>
         <w:pStyle w:val="Heading3"/>
@@ -2687,9 +2712,9 @@
         <w:t xml:space="preserve">Most midterm and final exam questions will be adapted from worksheet problems.</w:t>
       </w:r>
     </w:p>
-    <w:bookmarkEnd w:id="36"/>
     <w:bookmarkEnd w:id="37"/>
-    <w:bookmarkStart w:id="43" w:name="grading"/>
+    <w:bookmarkEnd w:id="38"/>
+    <w:bookmarkStart w:id="44" w:name="grading"/>
     <w:p>
       <w:pPr>
         <w:pStyle w:val="Heading2"/>
@@ -3106,7 +3131,7 @@
         <w:t xml:space="preserve">the weights above are the ones that count.</w:t>
       </w:r>
     </w:p>
-    <w:bookmarkStart w:id="38" w:name="homework-and-worksheets"/>
+    <w:bookmarkStart w:id="39" w:name="homework-and-worksheets"/>
     <w:p>
       <w:pPr>
         <w:pStyle w:val="Heading3"/>
@@ -3313,8 +3338,8 @@
         <w:t xml:space="preserve">on homework or on exams.</w:t>
       </w:r>
     </w:p>
-    <w:bookmarkEnd w:id="38"/>
-    <w:bookmarkStart w:id="39" w:name="labs"/>
+    <w:bookmarkEnd w:id="39"/>
+    <w:bookmarkStart w:id="40" w:name="labs"/>
     <w:p>
       <w:pPr>
         <w:pStyle w:val="Heading3"/>
@@ -3428,8 +3453,8 @@
         <w:t xml:space="preserve">Late lab submissions are not accepted.</w:t>
       </w:r>
     </w:p>
-    <w:bookmarkEnd w:id="39"/>
-    <w:bookmarkStart w:id="41" w:name="exams"/>
+    <w:bookmarkEnd w:id="40"/>
+    <w:bookmarkStart w:id="42" w:name="exams"/>
     <w:p>
       <w:pPr>
         <w:pStyle w:val="Heading3"/>
@@ -3455,17 +3480,7 @@
         <w:t xml:space="preserve"> </w:t>
       </w:r>
       <w:r>
-        <w:t xml:space="preserve">and a cumulative final exam during finals week (</w:t>
-      </w:r>
-      <w:r>
-        <w:rPr>
-          <w:b/>
-          <w:bCs/>
-        </w:rPr>
-        <w:t xml:space="preserve">TBD</w:t>
-      </w:r>
-      <w:r>
-        <w:t xml:space="preserve">),</w:t>
+        <w:t xml:space="preserve">and a cumulative final exam during finals week,</w:t>
       </w:r>
       <w:r>
         <w:t xml:space="preserve"> </w:t>
@@ -3476,7 +3491,7 @@
       <w:r>
         <w:t xml:space="preserve"> </w:t>
       </w:r>
-      <w:hyperlink r:id="rId40">
+      <w:hyperlink r:id="rId41">
         <w:r>
           <w:rPr>
             <w:rStyle w:val="Hyperlink"/>
@@ -3488,7 +3503,31 @@
         <w:t xml:space="preserve"> </w:t>
       </w:r>
       <w:r>
-        <w:t xml:space="preserve">assigns.</w:t>
+        <w:t xml:space="preserve">assigns,</w:t>
+      </w:r>
+      <w:r>
+        <w:t xml:space="preserve"> </w:t>
+      </w:r>
+      <w:r>
+        <w:t xml:space="preserve">which is set by the lecture time:</w:t>
+      </w:r>
+      <w:r>
+        <w:t xml:space="preserve"> </w:t>
+      </w:r>
+      <w:r>
+        <w:t xml:space="preserve">Tuesday, March 16 for the 11:00 sections (CRNs 13745 and 13746)</w:t>
+      </w:r>
+      <w:r>
+        <w:t xml:space="preserve"> </w:t>
+      </w:r>
+      <w:r>
+        <w:t xml:space="preserve">and Thursday, March 18 for the 9:00 sections (CRNs 13747 and 13748),</w:t>
+      </w:r>
+      <w:r>
+        <w:t xml:space="preserve"> </w:t>
+      </w:r>
+      <w:r>
+        <w:t xml:space="preserve">both 10:30am–12:30pm.</w:t>
       </w:r>
     </w:p>
     <w:p>
@@ -3547,8 +3586,8 @@
         <w:t xml:space="preserve">and we may be able to reschedule it.</w:t>
       </w:r>
     </w:p>
-    <w:bookmarkEnd w:id="41"/>
-    <w:bookmarkStart w:id="42" w:name="grading-questions"/>
+    <w:bookmarkEnd w:id="42"/>
+    <w:bookmarkStart w:id="43" w:name="grading-questions"/>
     <w:p>
       <w:pPr>
         <w:pStyle w:val="Heading3"/>
@@ -3597,9 +3636,9 @@
         <w:t xml:space="preserve">You will never lose points for asking.</w:t>
       </w:r>
     </w:p>
-    <w:bookmarkEnd w:id="42"/>
     <w:bookmarkEnd w:id="43"/>
-    <w:bookmarkStart w:id="44" w:name="deadlines-and-late-work"/>
+    <w:bookmarkEnd w:id="44"/>
+    <w:bookmarkStart w:id="45" w:name="deadlines-and-late-work"/>
     <w:p>
       <w:pPr>
         <w:pStyle w:val="Heading2"/>
@@ -3720,8 +3759,8 @@
         <w:t xml:space="preserve">contact me as soon as possible to discuss arrangements.</w:t>
       </w:r>
     </w:p>
-    <w:bookmarkEnd w:id="44"/>
-    <w:bookmarkStart w:id="45" w:name="collaboration-and-ai-tools"/>
+    <w:bookmarkEnd w:id="45"/>
+    <w:bookmarkStart w:id="46" w:name="collaboration-and-ai-tools"/>
     <w:p>
       <w:pPr>
         <w:pStyle w:val="Heading2"/>
@@ -3929,8 +3968,8 @@
         <w:t xml:space="preserve">.</w:t>
       </w:r>
     </w:p>
-    <w:bookmarkEnd w:id="45"/>
-    <w:bookmarkStart w:id="48" w:name="academic-honesty"/>
+    <w:bookmarkEnd w:id="46"/>
+    <w:bookmarkStart w:id="49" w:name="academic-honesty"/>
     <w:p>
       <w:pPr>
         <w:pStyle w:val="Heading2"/>
@@ -3961,7 +4000,7 @@
       <w:r>
         <w:t xml:space="preserve"> </w:t>
       </w:r>
-      <w:hyperlink r:id="rId46">
+      <w:hyperlink r:id="rId47">
         <w:r>
           <w:rPr>
             <w:rStyle w:val="Hyperlink"/>
@@ -3978,7 +4017,7 @@
       <w:r>
         <w:t xml:space="preserve"> </w:t>
       </w:r>
-      <w:hyperlink r:id="rId47">
+      <w:hyperlink r:id="rId48">
         <w:r>
           <w:rPr>
             <w:rStyle w:val="Hyperlink"/>
@@ -4017,8 +4056,8 @@
         <w:t xml:space="preserve">When in doubt, ask me.</w:t>
       </w:r>
     </w:p>
-    <w:bookmarkEnd w:id="48"/>
-    <w:bookmarkStart w:id="50" w:name="student-conduct"/>
+    <w:bookmarkEnd w:id="49"/>
+    <w:bookmarkStart w:id="51" w:name="student-conduct"/>
     <w:p>
       <w:pPr>
         <w:pStyle w:val="Heading2"/>
@@ -4049,7 +4088,7 @@
       <w:r>
         <w:t xml:space="preserve"> </w:t>
       </w:r>
-      <w:hyperlink r:id="rId49">
+      <w:hyperlink r:id="rId50">
         <w:r>
           <w:rPr>
             <w:rStyle w:val="Hyperlink"/>
@@ -4085,8 +4124,8 @@
         <w:t xml:space="preserve">Conduct is also considered when determining admission to the major.</w:t>
       </w:r>
     </w:p>
-    <w:bookmarkEnd w:id="50"/>
-    <w:bookmarkStart w:id="52" w:name="course-materials"/>
+    <w:bookmarkEnd w:id="51"/>
+    <w:bookmarkStart w:id="53" w:name="course-materials"/>
     <w:p>
       <w:pPr>
         <w:pStyle w:val="Heading2"/>
@@ -4123,7 +4162,7 @@
       <w:r>
         <w:t xml:space="preserve"> </w:t>
       </w:r>
-      <w:hyperlink r:id="rId51">
+      <w:hyperlink r:id="rId52">
         <w:r>
           <w:rPr>
             <w:rStyle w:val="Hyperlink"/>
@@ -4135,8 +4174,8 @@
         <w:t xml:space="preserve">.</w:t>
       </w:r>
     </w:p>
-    <w:bookmarkEnd w:id="52"/>
-    <w:bookmarkStart w:id="55" w:name="disabilities"/>
+    <w:bookmarkEnd w:id="53"/>
+    <w:bookmarkStart w:id="56" w:name="disabilities"/>
     <w:p>
       <w:pPr>
         <w:pStyle w:val="Heading2"/>
@@ -4173,7 +4212,7 @@
       <w:r>
         <w:t xml:space="preserve"> </w:t>
       </w:r>
-      <w:hyperlink r:id="rId53">
+      <w:hyperlink r:id="rId54">
         <w:r>
           <w:rPr>
             <w:rStyle w:val="Hyperlink"/>
@@ -4193,7 +4232,7 @@
       <w:r>
         <w:t xml:space="preserve"> </w:t>
       </w:r>
-      <w:hyperlink r:id="rId54">
+      <w:hyperlink r:id="rId55">
         <w:r>
           <w:rPr>
             <w:rStyle w:val="Hyperlink"/>
@@ -4205,8 +4244,8 @@
         <w:t xml:space="preserve">.</w:t>
       </w:r>
     </w:p>
-    <w:bookmarkEnd w:id="55"/>
-    <w:bookmarkStart w:id="61" w:name="student-services"/>
+    <w:bookmarkEnd w:id="56"/>
+    <w:bookmarkStart w:id="62" w:name="student-services"/>
     <w:p>
       <w:pPr>
         <w:pStyle w:val="Heading2"/>
@@ -4249,7 +4288,7 @@
       <w:r>
         <w:t xml:space="preserve"> </w:t>
       </w:r>
-      <w:hyperlink r:id="rId56">
+      <w:hyperlink r:id="rId57">
         <w:r>
           <w:rPr>
             <w:rStyle w:val="Hyperlink"/>
@@ -4287,7 +4326,7 @@
       <w:r>
         <w:t xml:space="preserve"> </w:t>
       </w:r>
-      <w:hyperlink r:id="rId57">
+      <w:hyperlink r:id="rId58">
         <w:r>
           <w:rPr>
             <w:rStyle w:val="Hyperlink"/>
@@ -4325,7 +4364,7 @@
       <w:r>
         <w:t xml:space="preserve"> </w:t>
       </w:r>
-      <w:hyperlink r:id="rId58">
+      <w:hyperlink r:id="rId59">
         <w:r>
           <w:rPr>
             <w:rStyle w:val="Hyperlink"/>
@@ -4357,7 +4396,7 @@
       <w:r>
         <w:t xml:space="preserve"> </w:t>
       </w:r>
-      <w:hyperlink r:id="rId59">
+      <w:hyperlink r:id="rId60">
         <w:r>
           <w:rPr>
             <w:rStyle w:val="Hyperlink"/>
@@ -4407,7 +4446,7 @@
       <w:r>
         <w:t xml:space="preserve"> </w:t>
       </w:r>
-      <w:hyperlink r:id="rId60">
+      <w:hyperlink r:id="rId61">
         <w:r>
           <w:rPr>
             <w:rStyle w:val="Hyperlink"/>
@@ -4434,8 +4473,8 @@
         <w:t xml:space="preserve">including sexual violence that they learn about, to the Title IX Coordinator.</w:t>
       </w:r>
     </w:p>
-    <w:bookmarkEnd w:id="61"/>
-    <w:bookmarkStart w:id="63" w:name="other-policies"/>
+    <w:bookmarkEnd w:id="62"/>
+    <w:bookmarkStart w:id="64" w:name="other-policies"/>
     <w:p>
       <w:pPr>
         <w:pStyle w:val="Heading2"/>
@@ -4454,7 +4493,7 @@
       <w:r>
         <w:t xml:space="preserve"> </w:t>
       </w:r>
-      <w:hyperlink r:id="rId62">
+      <w:hyperlink r:id="rId63">
         <w:r>
           <w:rPr>
             <w:rStyle w:val="Hyperlink"/>
@@ -4481,7 +4520,7 @@
         <w:t xml:space="preserve">ethical use of WWU computing resources, and the student conduct code.</w:t>
       </w:r>
     </w:p>
-    <w:bookmarkEnd w:id="63"/>
+    <w:bookmarkEnd w:id="64"/>
     <w:sectPr>
       <w:footnotePr>
         <w:numRestart w:val="eachSect"/>

</xml_diff>

<commit_message>
Deploying to gh-pages from @ Morrison-Lab/mcs@c9da1570bfb946a9d3cedfac0d75de8f84bdb8f4 🚀
</commit_message>
<xml_diff>
--- a/chapters/syllabus.docx
+++ b/chapters/syllabus.docx
@@ -23,7 +23,7 @@
         <w:pStyle w:val="Date"/>
       </w:pPr>
       <w:r>
-        <w:t xml:space="preserve">Last modified: 2026-10-28 15:59:36 (PDT)</w:t>
+        <w:t xml:space="preserve">Last modified: 2026-10-29 08:04:26 (PDT)</w:t>
       </w:r>
     </w:p>
     <w:tbl>
@@ -1237,7 +1237,7 @@
       </w:r>
     </w:p>
     <w:bookmarkEnd w:id="23"/>
-    <w:bookmarkStart w:id="30" w:name="schedule"/>
+    <w:bookmarkStart w:id="31" w:name="schedule"/>
     <w:p>
       <w:pPr>
         <w:pStyle w:val="Heading2"/>
@@ -1453,12 +1453,26 @@
               <w:jc w:val="left"/>
             </w:pPr>
             <w:r>
-              <w:t xml:space="preserve">Introduction to functional programming;</w:t>
+              <w:t xml:space="preserve">Introduction to</w:t>
             </w:r>
             <w:r>
               <w:t xml:space="preserve"> </w:t>
             </w:r>
             <w:hyperlink r:id="rId25">
+              <w:r>
+                <w:rPr>
+                  <w:rStyle w:val="Hyperlink"/>
+                </w:rPr>
+                <w:t xml:space="preserve">functional programming</w:t>
+              </w:r>
+            </w:hyperlink>
+            <w:r>
+              <w:t xml:space="preserve">;</w:t>
+            </w:r>
+            <w:r>
+              <w:t xml:space="preserve"> </w:t>
+            </w:r>
+            <w:hyperlink r:id="rId26">
               <w:r>
                 <w:rPr>
                   <w:rStyle w:val="Hyperlink"/>
@@ -1472,7 +1486,7 @@
             <w:r>
               <w:t xml:space="preserve"> </w:t>
             </w:r>
-            <w:hyperlink r:id="rId26">
+            <w:hyperlink r:id="rId27">
               <w:r>
                 <w:rPr>
                   <w:rStyle w:val="Hyperlink"/>
@@ -1486,7 +1500,7 @@
             <w:r>
               <w:t xml:space="preserve"> </w:t>
             </w:r>
-            <w:hyperlink r:id="rId27">
+            <w:hyperlink r:id="rId28">
               <w:r>
                 <w:rPr>
                   <w:rStyle w:val="Hyperlink"/>
@@ -1559,7 +1573,7 @@
             <w:r>
               <w:t xml:space="preserve"> </w:t>
             </w:r>
-            <w:hyperlink r:id="rId28">
+            <w:hyperlink r:id="rId29">
               <w:r>
                 <w:rPr>
                   <w:rStyle w:val="Hyperlink"/>
@@ -1573,7 +1587,7 @@
             <w:r>
               <w:t xml:space="preserve"> </w:t>
             </w:r>
-            <w:hyperlink r:id="rId29">
+            <w:hyperlink r:id="rId30">
               <w:r>
                 <w:rPr>
                   <w:rStyle w:val="Hyperlink"/>
@@ -2200,8 +2214,8 @@
         <w:t xml:space="preserve">at least two weeks before that exam is given.</w:t>
       </w:r>
     </w:p>
-    <w:bookmarkEnd w:id="30"/>
-    <w:bookmarkStart w:id="31" w:name="communication"/>
+    <w:bookmarkEnd w:id="31"/>
+    <w:bookmarkStart w:id="32" w:name="communication"/>
     <w:p>
       <w:pPr>
         <w:pStyle w:val="Heading2"/>
@@ -2366,8 +2380,8 @@
         <w:t xml:space="preserve">also go in a Canvas message to me, not to my email.</w:t>
       </w:r>
     </w:p>
-    <w:bookmarkEnd w:id="31"/>
-    <w:bookmarkStart w:id="32" w:name="questions-and-corrections"/>
+    <w:bookmarkEnd w:id="32"/>
+    <w:bookmarkStart w:id="33" w:name="questions-and-corrections"/>
     <w:p>
       <w:pPr>
         <w:pStyle w:val="Heading2"/>
@@ -2434,8 +2448,8 @@
         <w:t xml:space="preserve">If you are not, we can jointly find out where the confusion started.</w:t>
       </w:r>
     </w:p>
-    <w:bookmarkEnd w:id="32"/>
-    <w:bookmarkStart w:id="33" w:name="health-precautions"/>
+    <w:bookmarkEnd w:id="33"/>
+    <w:bookmarkStart w:id="34" w:name="health-precautions"/>
     <w:p>
       <w:pPr>
         <w:pStyle w:val="Heading2"/>
@@ -2470,8 +2484,8 @@
         <w:t xml:space="preserve">Please contact me if you have questions, concerns, or suggestions.</w:t>
       </w:r>
     </w:p>
-    <w:bookmarkEnd w:id="33"/>
-    <w:bookmarkStart w:id="35" w:name="software"/>
+    <w:bookmarkEnd w:id="34"/>
+    <w:bookmarkStart w:id="36" w:name="software"/>
     <w:p>
       <w:pPr>
         <w:pStyle w:val="Heading2"/>
@@ -2490,7 +2504,7 @@
       <w:r>
         <w:t xml:space="preserve"> </w:t>
       </w:r>
-      <w:hyperlink r:id="rId34">
+      <w:hyperlink r:id="rId35">
         <w:r>
           <w:rPr>
             <w:rStyle w:val="Hyperlink"/>
@@ -2526,8 +2540,8 @@
         <w:t xml:space="preserve">please use the default installed version.</w:t>
       </w:r>
     </w:p>
-    <w:bookmarkEnd w:id="35"/>
-    <w:bookmarkStart w:id="38" w:name="active-learning"/>
+    <w:bookmarkEnd w:id="36"/>
+    <w:bookmarkStart w:id="40" w:name="active-learning"/>
     <w:p>
       <w:pPr>
         <w:pStyle w:val="Heading2"/>
@@ -2574,7 +2588,7 @@
         <w:t xml:space="preserve">Please give me feedback about the structure of the class, the activities, or group dynamics.</w:t>
       </w:r>
     </w:p>
-    <w:bookmarkStart w:id="36" w:name="abcd-cards"/>
+    <w:bookmarkStart w:id="38" w:name="abcd-cards"/>
     <w:p>
       <w:pPr>
         <w:pStyle w:val="Heading3"/>
@@ -2636,24 +2650,25 @@
         <w:t xml:space="preserve"> </w:t>
       </w:r>
       <w:r>
-        <w:t xml:space="preserve">print a new, landscape-mode color copy (PDF:</w:t>
-      </w:r>
-      <w:r>
-        <w:t xml:space="preserve"> </w:t>
-      </w:r>
-      <w:r>
-        <w:rPr>
-          <w:b/>
-          <w:bCs/>
-        </w:rPr>
-        <w:t xml:space="preserve">TBD</w:t>
-      </w:r>
-      <w:r>
-        <w:t xml:space="preserve">).</w:t>
-      </w:r>
-    </w:p>
-    <w:bookmarkEnd w:id="36"/>
-    <w:bookmarkStart w:id="37" w:name="worksheets"/>
+        <w:t xml:space="preserve">print a new, landscape-mode color copy of the</w:t>
+      </w:r>
+      <w:r>
+        <w:t xml:space="preserve"> </w:t>
+      </w:r>
+      <w:hyperlink r:id="rId37">
+        <w:r>
+          <w:rPr>
+            <w:rStyle w:val="Hyperlink"/>
+          </w:rPr>
+          <w:t xml:space="preserve">ABCD card</w:t>
+        </w:r>
+      </w:hyperlink>
+      <w:r>
+        <w:t xml:space="preserve">.</w:t>
+      </w:r>
+    </w:p>
+    <w:bookmarkEnd w:id="38"/>
+    <w:bookmarkStart w:id="39" w:name="worksheets"/>
     <w:p>
       <w:pPr>
         <w:pStyle w:val="Heading3"/>
@@ -2712,9 +2727,9 @@
         <w:t xml:space="preserve">Most midterm and final exam questions will be adapted from worksheet problems.</w:t>
       </w:r>
     </w:p>
-    <w:bookmarkEnd w:id="37"/>
-    <w:bookmarkEnd w:id="38"/>
-    <w:bookmarkStart w:id="44" w:name="grading"/>
+    <w:bookmarkEnd w:id="39"/>
+    <w:bookmarkEnd w:id="40"/>
+    <w:bookmarkStart w:id="46" w:name="grading"/>
     <w:p>
       <w:pPr>
         <w:pStyle w:val="Heading2"/>
@@ -3131,7 +3146,7 @@
         <w:t xml:space="preserve">the weights above are the ones that count.</w:t>
       </w:r>
     </w:p>
-    <w:bookmarkStart w:id="39" w:name="homework-and-worksheets"/>
+    <w:bookmarkStart w:id="41" w:name="homework-and-worksheets"/>
     <w:p>
       <w:pPr>
         <w:pStyle w:val="Heading3"/>
@@ -3338,8 +3353,8 @@
         <w:t xml:space="preserve">on homework or on exams.</w:t>
       </w:r>
     </w:p>
-    <w:bookmarkEnd w:id="39"/>
-    <w:bookmarkStart w:id="40" w:name="labs"/>
+    <w:bookmarkEnd w:id="41"/>
+    <w:bookmarkStart w:id="42" w:name="labs"/>
     <w:p>
       <w:pPr>
         <w:pStyle w:val="Heading3"/>
@@ -3453,8 +3468,8 @@
         <w:t xml:space="preserve">Late lab submissions are not accepted.</w:t>
       </w:r>
     </w:p>
-    <w:bookmarkEnd w:id="40"/>
-    <w:bookmarkStart w:id="42" w:name="exams"/>
+    <w:bookmarkEnd w:id="42"/>
+    <w:bookmarkStart w:id="44" w:name="exams"/>
     <w:p>
       <w:pPr>
         <w:pStyle w:val="Heading3"/>
@@ -3491,7 +3506,7 @@
       <w:r>
         <w:t xml:space="preserve"> </w:t>
       </w:r>
-      <w:hyperlink r:id="rId41">
+      <w:hyperlink r:id="rId43">
         <w:r>
           <w:rPr>
             <w:rStyle w:val="Hyperlink"/>
@@ -3586,8 +3601,8 @@
         <w:t xml:space="preserve">and we may be able to reschedule it.</w:t>
       </w:r>
     </w:p>
-    <w:bookmarkEnd w:id="42"/>
-    <w:bookmarkStart w:id="43" w:name="grading-questions"/>
+    <w:bookmarkEnd w:id="44"/>
+    <w:bookmarkStart w:id="45" w:name="grading-questions"/>
     <w:p>
       <w:pPr>
         <w:pStyle w:val="Heading3"/>
@@ -3636,9 +3651,9 @@
         <w:t xml:space="preserve">You will never lose points for asking.</w:t>
       </w:r>
     </w:p>
-    <w:bookmarkEnd w:id="43"/>
-    <w:bookmarkEnd w:id="44"/>
-    <w:bookmarkStart w:id="45" w:name="deadlines-and-late-work"/>
+    <w:bookmarkEnd w:id="45"/>
+    <w:bookmarkEnd w:id="46"/>
+    <w:bookmarkStart w:id="47" w:name="deadlines-and-late-work"/>
     <w:p>
       <w:pPr>
         <w:pStyle w:val="Heading2"/>
@@ -3759,8 +3774,8 @@
         <w:t xml:space="preserve">contact me as soon as possible to discuss arrangements.</w:t>
       </w:r>
     </w:p>
-    <w:bookmarkEnd w:id="45"/>
-    <w:bookmarkStart w:id="46" w:name="collaboration-and-ai-tools"/>
+    <w:bookmarkEnd w:id="47"/>
+    <w:bookmarkStart w:id="48" w:name="collaboration-and-ai-tools"/>
     <w:p>
       <w:pPr>
         <w:pStyle w:val="Heading2"/>
@@ -3968,8 +3983,8 @@
         <w:t xml:space="preserve">.</w:t>
       </w:r>
     </w:p>
-    <w:bookmarkEnd w:id="46"/>
-    <w:bookmarkStart w:id="49" w:name="academic-honesty"/>
+    <w:bookmarkEnd w:id="48"/>
+    <w:bookmarkStart w:id="51" w:name="academic-honesty"/>
     <w:p>
       <w:pPr>
         <w:pStyle w:val="Heading2"/>
@@ -4000,7 +4015,7 @@
       <w:r>
         <w:t xml:space="preserve"> </w:t>
       </w:r>
-      <w:hyperlink r:id="rId47">
+      <w:hyperlink r:id="rId49">
         <w:r>
           <w:rPr>
             <w:rStyle w:val="Hyperlink"/>
@@ -4017,7 +4032,7 @@
       <w:r>
         <w:t xml:space="preserve"> </w:t>
       </w:r>
-      <w:hyperlink r:id="rId48">
+      <w:hyperlink r:id="rId50">
         <w:r>
           <w:rPr>
             <w:rStyle w:val="Hyperlink"/>
@@ -4056,8 +4071,8 @@
         <w:t xml:space="preserve">When in doubt, ask me.</w:t>
       </w:r>
     </w:p>
-    <w:bookmarkEnd w:id="49"/>
-    <w:bookmarkStart w:id="51" w:name="student-conduct"/>
+    <w:bookmarkEnd w:id="51"/>
+    <w:bookmarkStart w:id="53" w:name="student-conduct"/>
     <w:p>
       <w:pPr>
         <w:pStyle w:val="Heading2"/>
@@ -4088,7 +4103,7 @@
       <w:r>
         <w:t xml:space="preserve"> </w:t>
       </w:r>
-      <w:hyperlink r:id="rId50">
+      <w:hyperlink r:id="rId52">
         <w:r>
           <w:rPr>
             <w:rStyle w:val="Hyperlink"/>
@@ -4124,8 +4139,8 @@
         <w:t xml:space="preserve">Conduct is also considered when determining admission to the major.</w:t>
       </w:r>
     </w:p>
-    <w:bookmarkEnd w:id="51"/>
-    <w:bookmarkStart w:id="53" w:name="course-materials"/>
+    <w:bookmarkEnd w:id="53"/>
+    <w:bookmarkStart w:id="55" w:name="course-materials"/>
     <w:p>
       <w:pPr>
         <w:pStyle w:val="Heading2"/>
@@ -4162,7 +4177,7 @@
       <w:r>
         <w:t xml:space="preserve"> </w:t>
       </w:r>
-      <w:hyperlink r:id="rId52">
+      <w:hyperlink r:id="rId54">
         <w:r>
           <w:rPr>
             <w:rStyle w:val="Hyperlink"/>
@@ -4174,8 +4189,8 @@
         <w:t xml:space="preserve">.</w:t>
       </w:r>
     </w:p>
-    <w:bookmarkEnd w:id="53"/>
-    <w:bookmarkStart w:id="56" w:name="disabilities"/>
+    <w:bookmarkEnd w:id="55"/>
+    <w:bookmarkStart w:id="58" w:name="disabilities"/>
     <w:p>
       <w:pPr>
         <w:pStyle w:val="Heading2"/>
@@ -4212,7 +4227,7 @@
       <w:r>
         <w:t xml:space="preserve"> </w:t>
       </w:r>
-      <w:hyperlink r:id="rId54">
+      <w:hyperlink r:id="rId56">
         <w:r>
           <w:rPr>
             <w:rStyle w:val="Hyperlink"/>
@@ -4232,7 +4247,7 @@
       <w:r>
         <w:t xml:space="preserve"> </w:t>
       </w:r>
-      <w:hyperlink r:id="rId55">
+      <w:hyperlink r:id="rId57">
         <w:r>
           <w:rPr>
             <w:rStyle w:val="Hyperlink"/>
@@ -4244,8 +4259,8 @@
         <w:t xml:space="preserve">.</w:t>
       </w:r>
     </w:p>
-    <w:bookmarkEnd w:id="56"/>
-    <w:bookmarkStart w:id="62" w:name="student-services"/>
+    <w:bookmarkEnd w:id="58"/>
+    <w:bookmarkStart w:id="64" w:name="student-services"/>
     <w:p>
       <w:pPr>
         <w:pStyle w:val="Heading2"/>
@@ -4288,7 +4303,7 @@
       <w:r>
         <w:t xml:space="preserve"> </w:t>
       </w:r>
-      <w:hyperlink r:id="rId57">
+      <w:hyperlink r:id="rId59">
         <w:r>
           <w:rPr>
             <w:rStyle w:val="Hyperlink"/>
@@ -4326,7 +4341,7 @@
       <w:r>
         <w:t xml:space="preserve"> </w:t>
       </w:r>
-      <w:hyperlink r:id="rId58">
+      <w:hyperlink r:id="rId60">
         <w:r>
           <w:rPr>
             <w:rStyle w:val="Hyperlink"/>
@@ -4364,7 +4379,7 @@
       <w:r>
         <w:t xml:space="preserve"> </w:t>
       </w:r>
-      <w:hyperlink r:id="rId59">
+      <w:hyperlink r:id="rId61">
         <w:r>
           <w:rPr>
             <w:rStyle w:val="Hyperlink"/>
@@ -4396,7 +4411,7 @@
       <w:r>
         <w:t xml:space="preserve"> </w:t>
       </w:r>
-      <w:hyperlink r:id="rId60">
+      <w:hyperlink r:id="rId62">
         <w:r>
           <w:rPr>
             <w:rStyle w:val="Hyperlink"/>
@@ -4446,7 +4461,7 @@
       <w:r>
         <w:t xml:space="preserve"> </w:t>
       </w:r>
-      <w:hyperlink r:id="rId61">
+      <w:hyperlink r:id="rId63">
         <w:r>
           <w:rPr>
             <w:rStyle w:val="Hyperlink"/>
@@ -4473,8 +4488,8 @@
         <w:t xml:space="preserve">including sexual violence that they learn about, to the Title IX Coordinator.</w:t>
       </w:r>
     </w:p>
-    <w:bookmarkEnd w:id="62"/>
-    <w:bookmarkStart w:id="64" w:name="other-policies"/>
+    <w:bookmarkEnd w:id="64"/>
+    <w:bookmarkStart w:id="66" w:name="other-policies"/>
     <w:p>
       <w:pPr>
         <w:pStyle w:val="Heading2"/>
@@ -4493,7 +4508,7 @@
       <w:r>
         <w:t xml:space="preserve"> </w:t>
       </w:r>
-      <w:hyperlink r:id="rId63">
+      <w:hyperlink r:id="rId65">
         <w:r>
           <w:rPr>
             <w:rStyle w:val="Hyperlink"/>
@@ -4520,7 +4535,7 @@
         <w:t xml:space="preserve">ethical use of WWU computing resources, and the student conduct code.</w:t>
       </w:r>
     </w:p>
-    <w:bookmarkEnd w:id="64"/>
+    <w:bookmarkEnd w:id="66"/>
     <w:sectPr>
       <w:footnotePr>
         <w:numRestart w:val="eachSect"/>

</xml_diff>